<commit_message>
update: Master Reference LATEST → v13 [2026-05-18]
</commit_message>
<xml_diff>
--- a/docs/Claude_Environment_Master_Reference_LATEST.docx
+++ b/docs/Claude_Environment_Master_Reference_LATEST.docx
@@ -31,7 +31,7 @@
           <w:sz w:val="28"/>
           <w:szCs w:val="28"/>
         </w:rPr>
-        <w:t xml:space="preserve">v12 · May 18, 2026</w:t>
+        <w:t xml:space="preserve">v13 · May 18, 2026</w:t>
       </w:r>
     </w:p>
     <w:p>
@@ -77,7 +77,7 @@
           <w:sz w:val="24"/>
           <w:szCs w:val="24"/>
         </w:rPr>
-        <w:t xml:space="preserve">Skills Inventory (v12)</w:t>
+        <w:t xml:space="preserve">Skills Inventory (v13)</w:t>
       </w:r>
     </w:p>
     <w:tbl>
@@ -1598,6 +1598,101 @@
                 <w:sz w:val="19"/>
                 <w:szCs w:val="19"/>
               </w:rPr>
+              <w:t xml:space="preserve">v13</w:t>
+            </w:r>
+          </w:p>
+        </w:tc>
+        <w:tc>
+          <w:tcPr>
+            <w:tcW w:type="dxa" w:w="1440"/>
+            <w:tcBorders>
+              <w:top w:val="single" w:color="C0D8EE" w:sz="1"/>
+              <w:left w:val="single" w:color="C0D8EE" w:sz="1"/>
+              <w:bottom w:val="single" w:color="C0D8EE" w:sz="1"/>
+              <w:right w:val="single" w:color="C0D8EE" w:sz="1"/>
+            </w:tcBorders>
+            <w:shd w:fill="EBF3FA" w:val="clear"/>
+            <w:tcMar>
+              <w:top w:type="dxa" w:w="80"/>
+              <w:left w:type="dxa" w:w="120"/>
+              <w:bottom w:type="dxa" w:w="80"/>
+              <w:right w:type="dxa" w:w="120"/>
+            </w:tcMar>
+          </w:tcPr>
+          <w:p>
+            <w:r>
+              <w:rPr>
+                <w:rFonts w:ascii="Arial" w:cs="Arial" w:eastAsia="Arial" w:hAnsi="Arial"/>
+                <w:b/>
+                <w:bCs/>
+                <w:color w:val="404040"/>
+                <w:sz w:val="19"/>
+                <w:szCs w:val="19"/>
+              </w:rPr>
+              <w:t xml:space="preserve">May 18, 2026</w:t>
+            </w:r>
+          </w:p>
+        </w:tc>
+        <w:tc>
+          <w:tcPr>
+            <w:tcW w:type="dxa" w:w="7200"/>
+            <w:tcBorders>
+              <w:top w:val="single" w:color="C0D8EE" w:sz="1"/>
+              <w:left w:val="single" w:color="C0D8EE" w:sz="1"/>
+              <w:bottom w:val="single" w:color="C0D8EE" w:sz="1"/>
+              <w:right w:val="single" w:color="C0D8EE" w:sz="1"/>
+            </w:tcBorders>
+            <w:shd w:fill="EBF3FA" w:val="clear"/>
+            <w:tcMar>
+              <w:top w:type="dxa" w:w="80"/>
+              <w:left w:type="dxa" w:w="120"/>
+              <w:bottom w:type="dxa" w:w="80"/>
+              <w:right w:type="dxa" w:w="120"/>
+            </w:tcMar>
+          </w:tcPr>
+          <w:p>
+            <w:r>
+              <w:rPr>
+                <w:rFonts w:ascii="Arial" w:cs="Arial" w:eastAsia="Arial" w:hAnsi="Arial"/>
+                <w:b w:val="false"/>
+                <w:bCs w:val="false"/>
+                <w:color w:val="404040"/>
+                <w:sz w:val="19"/>
+                <w:szCs w:val="19"/>
+              </w:rPr>
+              <w:t xml:space="preserve">github-autosave fixed (username, URL, env.sh path); master-save updated to always show push-to-github reminder; push-to-github.sh shell function added to Scripts/; GITHUB_USER added to env.sh</w:t>
+            </w:r>
+          </w:p>
+        </w:tc>
+      </w:tr>
+      <w:tr>
+        <w:tc>
+          <w:tcPr>
+            <w:tcW w:type="dxa" w:w="720"/>
+            <w:tcBorders>
+              <w:top w:val="single" w:color="C0D8EE" w:sz="1"/>
+              <w:left w:val="single" w:color="C0D8EE" w:sz="1"/>
+              <w:bottom w:val="single" w:color="C0D8EE" w:sz="1"/>
+              <w:right w:val="single" w:color="C0D8EE" w:sz="1"/>
+            </w:tcBorders>
+            <w:shd w:fill="EBF3FA" w:val="clear"/>
+            <w:tcMar>
+              <w:top w:type="dxa" w:w="80"/>
+              <w:left w:type="dxa" w:w="120"/>
+              <w:bottom w:type="dxa" w:w="80"/>
+              <w:right w:type="dxa" w:w="120"/>
+            </w:tcMar>
+          </w:tcPr>
+          <w:p>
+            <w:r>
+              <w:rPr>
+                <w:rFonts w:ascii="Arial" w:cs="Arial" w:eastAsia="Arial" w:hAnsi="Arial"/>
+                <w:b/>
+                <w:bCs/>
+                <w:color w:val="404040"/>
+                <w:sz w:val="19"/>
+                <w:szCs w:val="19"/>
+              </w:rPr>
               <w:t xml:space="preserve">v12</w:t>
             </w:r>
           </w:p>
@@ -3118,7 +3213,7 @@
           <w:sz w:val="20"/>
           <w:szCs w:val="20"/>
         </w:rPr>
-        <w:t xml:space="preserve">Replaces both autosave and github-sync skills — unified in v8</w:t>
+        <w:t xml:space="preserve">Fixed in v13: correct username (gguzman), github.intuit.com URL, env.sh path (Scripts/); blocked report now shows push-to-github</w:t>
       </w:r>
     </w:p>
     <w:p>
@@ -3604,7 +3699,7 @@
           <w:sz w:val="20"/>
           <w:szCs w:val="20"/>
         </w:rPr>
-        <w:t xml:space="preserve">Routes to: github-autosave (code/skills/artifacts), cowork-backup (new projects/skills), save-master-reference-doc (env changes)</w:t>
+        <w:t xml:space="preserve">Updated v13: always ends with push-to-github reminder — Routes to: github-autosave, cowork-backup, save-master-reference-doc</w:t>
       </w:r>
     </w:p>
     <w:p>

</xml_diff>